<commit_message>
chore: update templates; resolved minor bug
</commit_message>
<xml_diff>
--- a/Templates/ORDER_AIR _No_PTO.docx
+++ b/Templates/ORDER_AIR _No_PTO.docx
@@ -488,20 +488,13 @@
         <w:jc w:val="both"/>
         <w:rPr>
           <w:rFonts w:ascii="Bookman Old Style" w:hAnsi="Bookman Old Style" w:cs="Arial"/>
-          <w:b/>
-        </w:rPr>
-      </w:pPr>
-      <w:r>
-        <w:rPr>
-          <w:rFonts w:ascii="Bookman Old Style" w:hAnsi="Bookman Old Style" w:cs="Arial"/>
-        </w:rPr>
-        <w:t xml:space="preserve">For consideration before the Board is the pollution case of Respondent docketed as </w:t>
-      </w:r>
-      <w:r>
-        <w:rPr>
-          <w:rFonts w:ascii="Bookman Old Style" w:hAnsi="Bookman Old Style" w:cs="Arial"/>
-        </w:rPr>
-        <w:t xml:space="preserve">DENR-PAB CASE NO. NCR </w:t>
+        </w:rPr>
+      </w:pPr>
+      <w:r>
+        <w:rPr>
+          <w:rFonts w:ascii="Bookman Old Style" w:hAnsi="Bookman Old Style" w:cs="Arial"/>
+        </w:rPr>
+        <w:t xml:space="preserve">For consideration before the Board is the pollution case of Respondent docketed as DENR-PAB CASE NO. NCR </w:t>
       </w:r>
       <w:r>
         <w:rPr>
@@ -527,13 +520,7 @@
         <w:rPr>
           <w:rFonts w:ascii="Bookman Old Style" w:hAnsi="Bookman Old Style" w:cs="Arial"/>
         </w:rPr>
-        <w:t>-2</w:t>
-      </w:r>
-      <w:r>
-        <w:rPr>
-          <w:rFonts w:ascii="Bookman Old Style" w:hAnsi="Bookman Old Style" w:cs="Arial"/>
-        </w:rPr>
-        <w:t>5A.</w:t>
+        <w:t>-25A.</w:t>
       </w:r>
     </w:p>
     <w:p>
@@ -556,31 +543,7 @@
         <w:rPr>
           <w:rFonts w:ascii="Bookman Old Style" w:hAnsi="Bookman Old Style" w:cs="Arial"/>
         </w:rPr>
-        <w:t>Records of the case reveal that</w:t>
-      </w:r>
-      <w:r>
-        <w:rPr>
-          <w:rFonts w:ascii="Bookman Old Style" w:hAnsi="Bookman Old Style" w:cs="Arial"/>
-        </w:rPr>
-        <w:t>,</w:t>
-      </w:r>
-      <w:r>
-        <w:rPr>
-          <w:rFonts w:ascii="Bookman Old Style" w:hAnsi="Bookman Old Style" w:cs="Arial"/>
-        </w:rPr>
-        <w:t xml:space="preserve"> </w:t>
-      </w:r>
-      <w:r>
-        <w:rPr>
-          <w:rFonts w:ascii="Bookman Old Style" w:hAnsi="Bookman Old Style" w:cs="Arial"/>
-        </w:rPr>
-        <w:t>b</w:t>
-      </w:r>
-      <w:r>
-        <w:rPr>
-          <w:rFonts w:ascii="Bookman Old Style" w:hAnsi="Bookman Old Style" w:cs="Arial"/>
-        </w:rPr>
-        <w:t xml:space="preserve">ased on the inspection on </w:t>
+        <w:t xml:space="preserve">Records of the case reveal that, based on the inspection on </w:t>
       </w:r>
       <w:r>
         <w:rPr>
@@ -612,26 +575,36 @@
         <w:rPr>
           <w:rFonts w:ascii="Bookman Old Style" w:hAnsi="Bookman Old Style" w:cs="Arial"/>
         </w:rPr>
-        <w:t xml:space="preserve">, Respondent </w:t>
-      </w:r>
-      <w:r>
-        <w:rPr>
-          <w:rFonts w:ascii="Bookman Old Style" w:hAnsi="Bookman Old Style" w:cs="Arial"/>
-        </w:rPr>
-        <w:t xml:space="preserve">is </w:t>
-      </w:r>
-      <w:r>
-        <w:rPr>
-          <w:rFonts w:ascii="Bookman Old Style" w:hAnsi="Bookman Old Style" w:cs="Arial"/>
-        </w:rPr>
-        <w:t>{% for v in</w:t>
-      </w:r>
-      <w:r>
-        <w:rPr>
-          <w:rFonts w:ascii="Bookman Old Style" w:hAnsi="Bookman Old Style" w:cs="Arial"/>
-        </w:rPr>
-        <w:t xml:space="preserve"> findings</w:t>
-      </w:r>
+        <w:t xml:space="preserve">, Respondent is </w:t>
+      </w:r>
+      <w:r>
+        <w:rPr>
+          <w:rFonts w:ascii="Bookman Old Style" w:hAnsi="Bookman Old Style" w:cs="Arial"/>
+        </w:rPr>
+        <w:t xml:space="preserve">{% for v in findings %} </w:t>
+      </w:r>
+      <w:proofErr w:type="gramStart"/>
+      <w:r>
+        <w:rPr>
+          <w:rFonts w:ascii="Bookman Old Style" w:hAnsi="Bookman Old Style" w:cs="Arial"/>
+        </w:rPr>
+        <w:t>{{ v</w:t>
+      </w:r>
+      <w:proofErr w:type="gramEnd"/>
+      <w:r>
+        <w:rPr>
+          <w:rFonts w:ascii="Bookman Old Style" w:hAnsi="Bookman Old Style" w:cs="Arial"/>
+        </w:rPr>
+        <w:t xml:space="preserve"> }} {% </w:t>
+      </w:r>
+      <w:proofErr w:type="spellStart"/>
+      <w:r>
+        <w:rPr>
+          <w:rFonts w:ascii="Bookman Old Style" w:hAnsi="Bookman Old Style" w:cs="Arial"/>
+        </w:rPr>
+        <w:t>endfor</w:t>
+      </w:r>
+      <w:proofErr w:type="spellEnd"/>
       <w:r>
         <w:rPr>
           <w:rFonts w:ascii="Bookman Old Style" w:hAnsi="Bookman Old Style" w:cs="Arial"/>
@@ -642,47 +615,7 @@
         <w:rPr>
           <w:rFonts w:ascii="Bookman Old Style" w:hAnsi="Bookman Old Style" w:cs="Arial"/>
         </w:rPr>
-        <w:t xml:space="preserve"> </w:t>
-      </w:r>
-      <w:proofErr w:type="gramStart"/>
-      <w:r>
-        <w:rPr>
-          <w:rFonts w:ascii="Bookman Old Style" w:hAnsi="Bookman Old Style" w:cs="Arial"/>
-        </w:rPr>
-        <w:t>{{ v</w:t>
-      </w:r>
-      <w:proofErr w:type="gramEnd"/>
-      <w:r>
-        <w:rPr>
-          <w:rFonts w:ascii="Bookman Old Style" w:hAnsi="Bookman Old Style" w:cs="Arial"/>
-        </w:rPr>
-        <w:t xml:space="preserve"> }} {% </w:t>
-      </w:r>
-      <w:proofErr w:type="spellStart"/>
-      <w:r>
-        <w:rPr>
-          <w:rFonts w:ascii="Bookman Old Style" w:hAnsi="Bookman Old Style" w:cs="Arial"/>
-        </w:rPr>
-        <w:t>endfor</w:t>
-      </w:r>
-      <w:proofErr w:type="spellEnd"/>
-      <w:r>
-        <w:rPr>
-          <w:rFonts w:ascii="Bookman Old Style" w:hAnsi="Bookman Old Style" w:cs="Arial"/>
-        </w:rPr>
-        <w:t xml:space="preserve"> %}</w:t>
-      </w:r>
-      <w:r>
-        <w:rPr>
-          <w:rFonts w:ascii="Bookman Old Style" w:hAnsi="Bookman Old Style" w:cs="Arial"/>
-        </w:rPr>
-        <w:t xml:space="preserve">, </w:t>
-      </w:r>
-      <w:r>
-        <w:rPr>
-          <w:rFonts w:ascii="Bookman Old Style" w:hAnsi="Bookman Old Style" w:cs="Arial"/>
-        </w:rPr>
-        <w:t xml:space="preserve">in violation of </w:t>
+        <w:t xml:space="preserve">, in violation of </w:t>
       </w:r>
       <w:r>
         <w:rPr>
@@ -751,23 +684,7 @@
           <w:color w:val="000000"/>
           <w:lang w:val="en-PH" w:eastAsia="en-PH"/>
         </w:rPr>
-        <w:t xml:space="preserve"> </w:t>
-      </w:r>
-      <w:r>
-        <w:rPr>
-          <w:rFonts w:ascii="Bookman Old Style" w:hAnsi="Bookman Old Style"/>
-          <w:color w:val="000000"/>
-          <w:lang w:val="en-PH" w:eastAsia="en-PH"/>
-        </w:rPr>
-        <w:t>and was given an opportunity to explain why it should n</w:t>
-      </w:r>
-      <w:r>
-        <w:rPr>
-          <w:rFonts w:ascii="Bookman Old Style" w:hAnsi="Bookman Old Style"/>
-          <w:color w:val="000000"/>
-          <w:lang w:val="en-PH" w:eastAsia="en-PH"/>
-        </w:rPr>
-        <w:t xml:space="preserve">ot be penalized under the law. </w:t>
+        <w:t xml:space="preserve"> and was given an opportunity to explain why it should not be penalized under the law. </w:t>
       </w:r>
     </w:p>
     <w:p>

</xml_diff>